<commit_message>
Customer doc: add the architecture diagram as Figure 1
</commit_message>
<xml_diff>
--- a/docs/customer/Valuation assistant prototype - scope, design decisions, and path to production.docx
+++ b/docs/customer/Valuation assistant prototype - scope, design decisions, and path to production.docx
@@ -10,7 +10,7 @@
         <w:t xml:space="preserve">Valuation assistant prototype: scope, design decisions, and path to production</w:t>
       </w:r>
     </w:p>
-    <w:bookmarkStart w:id="34" w:name="X2b4eea9d7ae88626b4c289763a8389ee0133204"/>
+    <w:bookmarkStart w:id="37" w:name="X2b4eea9d7ae88626b4c289763a8389ee0133204"/>
     <w:p>
       <w:pPr>
         <w:pStyle w:val="Heading1"/>
@@ -848,7 +848,7 @@
     </w:tbl>
     <w:bookmarkEnd w:id="15"/>
     <w:bookmarkEnd w:id="16"/>
-    <w:bookmarkStart w:id="17" w:name="how-it-works"/>
+    <w:bookmarkStart w:id="20" w:name="how-it-works"/>
     <w:p>
       <w:pPr>
         <w:pStyle w:val="Heading2"/>
@@ -860,6 +860,73 @@
     <w:p>
       <w:pPr>
         <w:pStyle w:val="FirstParagraph"/>
+      </w:pPr>
+      <w:r>
+        <w:t xml:space="preserve">Figure 1 shows the prototype architecture. Numbered steps in the figure match the steps below. Dashed boxes are services planned for production.</w:t>
+      </w:r>
+    </w:p>
+    <w:p>
+      <w:pPr>
+        <w:pStyle w:val="BodyText"/>
+      </w:pPr>
+      <w:r>
+        <w:drawing>
+          <wp:inline>
+            <wp:extent cx="5334000" cy="3142615"/>
+            <wp:effectExtent b="0" l="0" r="0" t="0"/>
+            <wp:docPr descr="Prototype architecture on Google Cloud" title="" id="18" name="Picture"/>
+            <a:graphic>
+              <a:graphicData uri="http://schemas.openxmlformats.org/drawingml/2006/picture">
+                <pic:pic>
+                  <pic:nvPicPr>
+                    <pic:cNvPr descr="architecture.png" id="19" name="Picture"/>
+                    <pic:cNvPicPr>
+                      <a:picLocks noChangeArrowheads="1" noChangeAspect="1"/>
+                    </pic:cNvPicPr>
+                  </pic:nvPicPr>
+                  <pic:blipFill>
+                    <a:blip r:embed="rId17"/>
+                    <a:stretch>
+                      <a:fillRect/>
+                    </a:stretch>
+                  </pic:blipFill>
+                  <pic:spPr bwMode="auto">
+                    <a:xfrm>
+                      <a:off x="0" y="0"/>
+                      <a:ext cx="5334000" cy="3142615"/>
+                    </a:xfrm>
+                    <a:prstGeom prst="rect">
+                      <a:avLst/>
+                    </a:prstGeom>
+                    <a:noFill/>
+                    <a:ln w="9525">
+                      <a:noFill/>
+                      <a:headEnd/>
+                      <a:tailEnd/>
+                    </a:ln>
+                  </pic:spPr>
+                </pic:pic>
+              </a:graphicData>
+            </a:graphic>
+          </wp:inline>
+        </w:drawing>
+      </w:r>
+    </w:p>
+    <w:p>
+      <w:pPr>
+        <w:pStyle w:val="BodyText"/>
+      </w:pPr>
+      <w:r>
+        <w:rPr>
+          <w:i/>
+          <w:iCs/>
+        </w:rPr>
+        <w:t xml:space="preserve">Figure 1. Prototype architecture. Icons are from the official Google Cloud icon set.</w:t>
+      </w:r>
+    </w:p>
+    <w:p>
+      <w:pPr>
+        <w:pStyle w:val="BodyText"/>
       </w:pPr>
       <w:r>
         <w:t xml:space="preserve">The following steps describe the flow from a landed document to an answer:</w:t>
@@ -982,8 +1049,8 @@
         <w:t xml:space="preserve">The agent writes a short answer that cites document pages. All numbers in the answer come from tool outputs.</w:t>
       </w:r>
     </w:p>
-    <w:bookmarkEnd w:id="17"/>
-    <w:bookmarkStart w:id="18" w:name="design-decisions"/>
+    <w:bookmarkEnd w:id="20"/>
+    <w:bookmarkStart w:id="21" w:name="design-decisions"/>
     <w:p>
       <w:pPr>
         <w:pStyle w:val="Heading2"/>
@@ -1217,8 +1284,8 @@
         </w:tc>
       </w:tr>
     </w:tbl>
-    <w:bookmarkEnd w:id="18"/>
-    <w:bookmarkStart w:id="19" w:name="model-selection"/>
+    <w:bookmarkEnd w:id="21"/>
+    <w:bookmarkStart w:id="22" w:name="model-selection"/>
     <w:p>
       <w:pPr>
         <w:pStyle w:val="Heading2"/>
@@ -1856,8 +1923,8 @@
         </w:tc>
       </w:tr>
     </w:tbl>
-    <w:bookmarkEnd w:id="19"/>
-    <w:bookmarkStart w:id="20" w:name="lessons-from-testing"/>
+    <w:bookmarkEnd w:id="22"/>
+    <w:bookmarkStart w:id="23" w:name="lessons-from-testing"/>
     <w:p>
       <w:pPr>
         <w:pStyle w:val="Heading2"/>
@@ -1984,8 +2051,8 @@
         <w:t xml:space="preserve">Calls now retry, fall back to the global endpoint, and then show a clearly labeled saved answer.</w:t>
       </w:r>
     </w:p>
-    <w:bookmarkEnd w:id="20"/>
-    <w:bookmarkStart w:id="21" w:name="measured-results"/>
+    <w:bookmarkEnd w:id="23"/>
+    <w:bookmarkStart w:id="24" w:name="measured-results"/>
     <w:p>
       <w:pPr>
         <w:pStyle w:val="Heading2"/>
@@ -2172,8 +2239,8 @@
         </w:tc>
       </w:tr>
     </w:tbl>
-    <w:bookmarkEnd w:id="21"/>
-    <w:bookmarkStart w:id="22" w:name="cost-estimate"/>
+    <w:bookmarkEnd w:id="24"/>
+    <w:bookmarkStart w:id="25" w:name="cost-estimate"/>
     <w:p>
       <w:pPr>
         <w:pStyle w:val="Heading2"/>
@@ -2499,8 +2566,8 @@
         <w:t xml:space="preserve">To reduce cost, consider a Document AI savings plan ($8 per 1,000 pages), a capped Gemini thinking budget for extraction, and parsing only new or changed documents.</w:t>
       </w:r>
     </w:p>
-    <w:bookmarkEnd w:id="22"/>
-    <w:bookmarkStart w:id="30" w:name="faq-scope-and-production-readiness"/>
+    <w:bookmarkEnd w:id="25"/>
+    <w:bookmarkStart w:id="33" w:name="faq-scope-and-production-readiness"/>
     <w:p>
       <w:pPr>
         <w:pStyle w:val="Heading2"/>
@@ -2517,7 +2584,7 @@
         <w:t xml:space="preserve">Each answer describes what the prototype does today and what a production deployment needs.</w:t>
       </w:r>
     </w:p>
-    <w:bookmarkStart w:id="23" w:name="data-and-ingestion"/>
+    <w:bookmarkStart w:id="26" w:name="data-and-ingestion"/>
     <w:p>
       <w:pPr>
         <w:pStyle w:val="Heading3"/>
@@ -2973,8 +3040,8 @@
         <w:t xml:space="preserve">Run Sensitive Data Protection on every chunk before embedding, mask names and loan numbers, and apply BigQuery column-level security and policy tags.</w:t>
       </w:r>
     </w:p>
-    <w:bookmarkEnd w:id="23"/>
-    <w:bookmarkStart w:id="24" w:name="retrieval-and-ai"/>
+    <w:bookmarkEnd w:id="26"/>
+    <w:bookmarkStart w:id="27" w:name="retrieval-and-ai"/>
     <w:p>
       <w:pPr>
         <w:pStyle w:val="Heading3"/>
@@ -3364,8 +3431,8 @@
         <w:t xml:space="preserve">Pin versions, re-embed all chunks when the embedding model changes, and test prompts against the evaluation set before an upgrade.</w:t>
       </w:r>
     </w:p>
-    <w:bookmarkEnd w:id="24"/>
-    <w:bookmarkStart w:id="25" w:name="valuation-and-models"/>
+    <w:bookmarkEnd w:id="27"/>
+    <w:bookmarkStart w:id="28" w:name="valuation-and-models"/>
     <w:p>
       <w:pPr>
         <w:pStyle w:val="Heading3"/>
@@ -3686,8 +3753,8 @@
         <w:t xml:space="preserve">Add appraiser sign-off with credential verification, an electronic signature, and a locked record.</w:t>
       </w:r>
     </w:p>
-    <w:bookmarkEnd w:id="25"/>
-    <w:bookmarkStart w:id="26" w:name="models-and-model-selection"/>
+    <w:bookmarkEnd w:id="28"/>
+    <w:bookmarkStart w:id="29" w:name="models-and-model-selection"/>
     <w:p>
       <w:pPr>
         <w:pStyle w:val="Heading3"/>
@@ -4092,8 +4159,8 @@
         <w:t xml:space="preserve">Retrain the AVM and adjustment models monthly and the market index as new sales close, with scheduled queries or Vertex AI Pipelines. Closed sales are the only training labels. Reviewer overrides feed evaluation and gate tuning, never training, so a mistaken override can't teach the model.</w:t>
       </w:r>
     </w:p>
-    <w:bookmarkEnd w:id="26"/>
-    <w:bookmarkStart w:id="27" w:name="security-governance-and-compliance"/>
+    <w:bookmarkEnd w:id="29"/>
+    <w:bookmarkStart w:id="30" w:name="security-governance-and-compliance"/>
     <w:p>
       <w:pPr>
         <w:pStyle w:val="Heading3"/>
@@ -4357,8 +4424,8 @@
         <w:t xml:space="preserve">Source conflict-of-interest data from the loan origination system instead of a fixed setting.</w:t>
       </w:r>
     </w:p>
-    <w:bookmarkEnd w:id="27"/>
-    <w:bookmarkStart w:id="28" w:name="operations"/>
+    <w:bookmarkEnd w:id="30"/>
+    <w:bookmarkStart w:id="31" w:name="operations"/>
     <w:p>
       <w:pPr>
         <w:pStyle w:val="Heading3"/>
@@ -4571,8 +4638,8 @@
         <w:t xml:space="preserve">Set budgets and alerts, cache parsing by content hash, cap the Gemini thinking budget for extraction, and use batch pricing for backlogs.</w:t>
       </w:r>
     </w:p>
-    <w:bookmarkEnd w:id="28"/>
-    <w:bookmarkStart w:id="29" w:name="product-and-integration"/>
+    <w:bookmarkEnd w:id="31"/>
+    <w:bookmarkStart w:id="32" w:name="product-and-integration"/>
     <w:p>
       <w:pPr>
         <w:pStyle w:val="Heading3"/>
@@ -4677,9 +4744,9 @@
         <w:t xml:space="preserve">Complete both with appraisal reviewers.</w:t>
       </w:r>
     </w:p>
-    <w:bookmarkEnd w:id="29"/>
-    <w:bookmarkEnd w:id="30"/>
-    <w:bookmarkStart w:id="31" w:name="recommended-next-steps"/>
+    <w:bookmarkEnd w:id="32"/>
+    <w:bookmarkEnd w:id="33"/>
+    <w:bookmarkStart w:id="34" w:name="recommended-next-steps"/>
     <w:p>
       <w:pPr>
         <w:pStyle w:val="Heading2"/>
@@ -4876,8 +4943,8 @@
         <w:t xml:space="preserve">Which county and which document types should the pilot start with?</w:t>
       </w:r>
     </w:p>
-    <w:bookmarkEnd w:id="31"/>
-    <w:bookmarkStart w:id="32" w:name="X9b679433d2d708ebc0028b1a5955fedfe277553"/>
+    <w:bookmarkEnd w:id="34"/>
+    <w:bookmarkStart w:id="35" w:name="X9b679433d2d708ebc0028b1a5955fedfe277553"/>
     <w:p>
       <w:pPr>
         <w:pStyle w:val="Heading2"/>
@@ -5326,8 +5393,8 @@
         </w:tc>
       </w:tr>
     </w:tbl>
-    <w:bookmarkEnd w:id="32"/>
-    <w:bookmarkStart w:id="33" w:name="appendix-b-references"/>
+    <w:bookmarkEnd w:id="35"/>
+    <w:bookmarkStart w:id="36" w:name="appendix-b-references"/>
     <w:p>
       <w:pPr>
         <w:pStyle w:val="Heading2"/>
@@ -5408,8 +5475,8 @@
         <w:t xml:space="preserve">Document AI Layout Parser: https://cloud.google.com/document-ai/docs/layout-parse-chunk</w:t>
       </w:r>
     </w:p>
-    <w:bookmarkEnd w:id="33"/>
-    <w:bookmarkEnd w:id="34"/>
+    <w:bookmarkEnd w:id="36"/>
+    <w:bookmarkEnd w:id="37"/>
     <w:sectPr>
       <w:footnotePr>
         <w:numRestart w:val="eachSect"/>

</xml_diff>

<commit_message>
Move the agent to Gemini 3.8 Flash; rename Vertex AI to Gemini Enterprise Agent Platform
- Agent: gemini-3.8-flash on the global endpoint at a low thinking level
  (default thinking took 16-62 s; low takes 9-19 s with the same tool calls)
- Fallback on quota errors: gemini-2.5-flash in us-central1
- Extraction stays on gemini-2.5-flash (lowest-cost model that extracts correctly)
- Docs, diagram, and customer doc use the current platform name and measured costs
</commit_message>
<xml_diff>
--- a/docs/customer/Valuation assistant prototype - scope, design decisions, and path to production.docx
+++ b/docs/customer/Valuation assistant prototype - scope, design decisions, and path to production.docx
@@ -246,7 +246,7 @@
         </w:numPr>
       </w:pPr>
       <w:r>
-        <w:t xml:space="preserve">Answers questions through a Gemini agent that calls tools. The agent explains; a deterministic valuation engine backed by BigQuery ML computes.</w:t>
+        <w:t xml:space="preserve">Answers questions through a Gemini agent on Gemini Enterprise Agent Platform (formerly Agent Platform) that calls tools. The agent explains; a deterministic valuation engine backed by BigQuery ML computes.</w:t>
       </w:r>
     </w:p>
     <w:p>
@@ -523,7 +523,7 @@
               </w:numPr>
             </w:pPr>
             <w:r>
-              <w:t xml:space="preserve">Enabled eight Google Cloud APIs and provisioned Cloud Storage buckets, BigQuery datasets, a BigQuery Cloud resource connection to Vertex AI, a Document AI Layout Parser processor, and Pub/Sub topics. Provisioning used Python SDK scripts that are committed to the repository.</w:t>
+              <w:t xml:space="preserve">Enabled eight Google Cloud APIs and provisioned Cloud Storage buckets, BigQuery datasets, a BigQuery Cloud resource connection to Agent Platform, a Document AI Layout Parser processor, and Pub/Sub topics. Provisioning used Python SDK scripts that are committed to the repository.</w:t>
             </w:r>
           </w:p>
           <w:p>
@@ -1138,7 +1138,7 @@
               <w:pStyle w:val="Compact"/>
             </w:pPr>
             <w:r>
-              <w:t xml:space="preserve">At high query volume, move retrieval to Vertex AI Vector Search. Only the retrieval function changes.</w:t>
+              <w:t xml:space="preserve">At high query volume, move retrieval to Vector Search in Agent Platform. Only the retrieval function changes.</w:t>
             </w:r>
           </w:p>
         </w:tc>
@@ -1394,40 +1394,40 @@
               <w:pStyle w:val="Compact"/>
             </w:pPr>
             <w:r>
-              <w:t xml:space="preserve">Gemini 2.5 Flash</w:t>
-            </w:r>
-          </w:p>
-        </w:tc>
-        <w:tc>
-          <w:tcPr/>
-          <w:p>
-            <w:pPr>
-              <w:pStyle w:val="Compact"/>
-            </w:pPr>
-            <w:r>
-              <w:t xml:space="preserve">Reliable function calling, low latency, and low cost. The agent explains and cites; it doesn't compute, so it doesn't need the strongest reasoning model.</w:t>
-            </w:r>
-          </w:p>
-        </w:tc>
-        <w:tc>
-          <w:tcPr/>
-          <w:p>
-            <w:pPr>
-              <w:pStyle w:val="Compact"/>
-            </w:pPr>
-            <w:r>
-              <w:t xml:space="preserve">Gemini 2.5 Pro (stronger reasoning, higher cost and latency); Gemini 2.5 Flash-Lite (lower cost); open models in Vertex AI Model Garden (more to operate)</w:t>
-            </w:r>
-          </w:p>
-        </w:tc>
-        <w:tc>
-          <w:tcPr/>
-          <w:p>
-            <w:pPr>
-              <w:pStyle w:val="Compact"/>
-            </w:pPr>
-            <w:r>
-              <w:t xml:space="preserve">In 3 of 3 runs of the demo question, the agent called all three tools and cited the correct page. 5–10 seconds and about $0.0033 per answer.</w:t>
+              <w:t xml:space="preserve">Gemini 3.8 Flash, low thinking level</w:t>
+            </w:r>
+          </w:p>
+        </w:tc>
+        <w:tc>
+          <w:tcPr/>
+          <w:p>
+            <w:pPr>
+              <w:pStyle w:val="Compact"/>
+            </w:pPr>
+            <w:r>
+              <w:t xml:space="preserve">The newest Flash model, where users see the reasoning. Reliable function calling. The agent explains and cites; it doesn't compute, so a low thinking level is enough.</w:t>
+            </w:r>
+          </w:p>
+        </w:tc>
+        <w:tc>
+          <w:tcPr/>
+          <w:p>
+            <w:pPr>
+              <w:pStyle w:val="Compact"/>
+            </w:pPr>
+            <w:r>
+              <w:t xml:space="preserve">Gemini 2.5 Flash (about a third of the cost, faster in-region, an older generation); Gemini Pro models (stronger reasoning, higher cost and latency); open models in Model Garden in Agent Platform (more to operate)</w:t>
+            </w:r>
+          </w:p>
+        </w:tc>
+        <w:tc>
+          <w:tcPr/>
+          <w:p>
+            <w:pPr>
+              <w:pStyle w:val="Compact"/>
+            </w:pPr>
+            <w:r>
+              <w:t xml:space="preserve">All three tools called and the correct page cited in every test run, including every demo scenario. 9–19 seconds per answer and about $0.011 (4 calls, 6,065 input and about 275 output tokens). The default thinking level took 16–62 seconds, so the agent uses the low level.</w:t>
             </w:r>
           </w:p>
         </w:tc>
@@ -1749,7 +1749,7 @@
               <w:pStyle w:val="Compact"/>
             </w:pPr>
             <w:r>
-              <w:t xml:space="preserve">Vertex AI AutoML Tabular or custom XGBoost training; hedonic linear regression</w:t>
+              <w:t xml:space="preserve">Agent Platform AutoML Tabular or custom XGBoost training; hedonic linear regression</w:t>
             </w:r>
           </w:p>
         </w:tc>
@@ -2048,7 +2048,19 @@
         <w:t xml:space="preserve"> </w:t>
       </w:r>
       <w:r>
-        <w:t xml:space="preserve">Calls now retry, fall back to the global endpoint, and then show a clearly labeled saved answer.</w:t>
+        <w:t xml:space="preserve">Calls now retry, fall back from Gemini 3.8 Flash on the global endpoint to Gemini 2.5 Flash in</w:t>
+      </w:r>
+      <w:r>
+        <w:t xml:space="preserve"> </w:t>
+      </w:r>
+      <w:r>
+        <w:rPr>
+          <w:rStyle w:val="VerbatimChar"/>
+        </w:rPr>
+        <w:t xml:space="preserve">us-central1</w:t>
+      </w:r>
+      <w:r>
+        <w:t xml:space="preserve">, and then show a clearly labeled saved answer.</w:t>
       </w:r>
     </w:p>
     <w:bookmarkEnd w:id="23"/>
@@ -2150,18 +2162,18 @@
               <w:pStyle w:val="Compact"/>
             </w:pPr>
             <w:r>
-              <w:t xml:space="preserve">Time to answer a question (4 model calls)</w:t>
-            </w:r>
-          </w:p>
-        </w:tc>
-        <w:tc>
-          <w:tcPr/>
-          <w:p>
-            <w:pPr>
-              <w:pStyle w:val="Compact"/>
-            </w:pPr>
-            <w:r>
-              <w:t xml:space="preserve">5–10 seconds after warm-up</w:t>
+              <w:t xml:space="preserve">Time to answer a question (4 model calls, Gemini 3.8 Flash)</w:t>
+            </w:r>
+          </w:p>
+        </w:tc>
+        <w:tc>
+          <w:tcPr/>
+          <w:p>
+            <w:pPr>
+              <w:pStyle w:val="Compact"/>
+            </w:pPr>
+            <w:r>
+              <w:t xml:space="preserve">9–19 seconds after warm-up; follow-up questions 2–6 seconds</w:t>
             </w:r>
           </w:p>
         </w:tc>
@@ -2477,29 +2489,29 @@
               <w:pStyle w:val="Compact"/>
             </w:pPr>
             <w:r>
-              <w:t xml:space="preserve">Gemini 2.5 Flash, per answer</w:t>
-            </w:r>
-          </w:p>
-        </w:tc>
-        <w:tc>
-          <w:tcPr/>
-          <w:p>
-            <w:pPr>
-              <w:pStyle w:val="Compact"/>
-            </w:pPr>
-            <w:r>
-              <w:t xml:space="preserve">4 calls, 5,862 input and 607 output tokens (measured)</w:t>
-            </w:r>
-          </w:p>
-        </w:tc>
-        <w:tc>
-          <w:tcPr/>
-          <w:p>
-            <w:pPr>
-              <w:pStyle w:val="Compact"/>
-            </w:pPr>
-            <w:r>
-              <w:t xml:space="preserve">$0.0033 per answer</w:t>
+              <w:t xml:space="preserve">Gemini 3.8 Flash, per answer</w:t>
+            </w:r>
+          </w:p>
+        </w:tc>
+        <w:tc>
+          <w:tcPr/>
+          <w:p>
+            <w:pPr>
+              <w:pStyle w:val="Compact"/>
+            </w:pPr>
+            <w:r>
+              <w:t xml:space="preserve">4 calls, 6,065 input and about 275 output tokens (measured); $1.50 and $7.50 per 1M input and output tokens</w:t>
+            </w:r>
+          </w:p>
+        </w:tc>
+        <w:tc>
+          <w:tcPr/>
+          <w:p>
+            <w:pPr>
+              <w:pStyle w:val="Compact"/>
+            </w:pPr>
+            <w:r>
+              <w:t xml:space="preserve">$0.011 per answer</w:t>
             </w:r>
           </w:p>
         </w:tc>
@@ -2555,7 +2567,7 @@
         <w:t xml:space="preserve"> </w:t>
       </w:r>
       <w:r>
-        <w:t xml:space="preserve">For one county with 100,000 pages of backlog and 20,000 questions a month, the estimate is about $1,350 one time to parse the backlog, and about $110 a month to run (answers about $66, one always-on Cloud Run instance about $44, BigQuery $0 within free tiers). These volumes are assumptions; we'll size the pilot with your actual volumes.</w:t>
+        <w:t xml:space="preserve">For one county with 100,000 pages of backlog and 20,000 questions a month, the estimate is about $1,350 one time to parse the backlog, and about $270 a month to run (answers about $225, one always-on Cloud Run instance about $44, BigQuery $0 within free tiers). These volumes are assumptions; we'll size the pilot with your actual volumes.</w:t>
       </w:r>
     </w:p>
     <w:p>
@@ -3110,7 +3122,7 @@
         <w:t xml:space="preserve"> </w:t>
       </w:r>
       <w:r>
-        <w:t xml:space="preserve">Create a BigQuery vector index when the table grows large, and move to Vertex AI Vector Search if query volume requires millisecond latency.</w:t>
+        <w:t xml:space="preserve">Create a BigQuery vector index when the table grows large, and move to Vector Search in Agent Platform if query volume requires millisecond latency.</w:t>
       </w:r>
     </w:p>
     <w:p>
@@ -3158,7 +3170,7 @@
         <w:t xml:space="preserve"> </w:t>
       </w:r>
       <w:r>
-        <w:t xml:space="preserve">Add keyword matching for exact terms such as permit numbers and addresses, and rerank results with the Vertex AI ranking API.</w:t>
+        <w:t xml:space="preserve">Add keyword matching for exact terms such as permit numbers and addresses, and rerank results with the ranking API in Agent Platform.</w:t>
       </w:r>
     </w:p>
     <w:p>
@@ -3206,7 +3218,7 @@
         <w:t xml:space="preserve"> </w:t>
       </w:r>
       <w:r>
-        <w:t xml:space="preserve">Build an evaluation set of real questions with expected facts and citations. Score groundedness, citation accuracy, and refusal behavior with the Gen AI evaluation service in Vertex AI, and run it on every prompt or model change.</w:t>
+        <w:t xml:space="preserve">Build an evaluation set of real questions with expected facts and citations. Score groundedness, citation accuracy, and refusal behavior with the Gen AI evaluation service in Agent Platform, and run it on every prompt or model change.</w:t>
       </w:r>
     </w:p>
     <w:p>
@@ -3284,7 +3296,7 @@
         <w:t xml:space="preserve"> </w:t>
       </w:r>
       <w:r>
-        <w:t xml:space="preserve">The app retries, falls back to the global endpoint, and then shows a saved answer with a clear label. The saved-answer fallback is for demos only.</w:t>
+        <w:t xml:space="preserve">The app retries, falls back to Gemini 2.5 Flash in a different region, and then shows a saved answer with a clear label. The saved-answer fallback is for demos only.</w:t>
       </w:r>
     </w:p>
     <w:p>
@@ -3389,13 +3401,28 @@
         <w:rPr>
           <w:rStyle w:val="VerbatimChar"/>
         </w:rPr>
+        <w:t xml:space="preserve">gemini-3.8-flash</w:t>
+      </w:r>
+      <w:r>
+        <w:t xml:space="preserve"> </w:t>
+      </w:r>
+      <w:r>
+        <w:t xml:space="preserve">(agent),</w:t>
+      </w:r>
+      <w:r>
+        <w:t xml:space="preserve"> </w:t>
+      </w:r>
+      <w:r>
+        <w:rPr>
+          <w:rStyle w:val="VerbatimChar"/>
+        </w:rPr>
         <w:t xml:space="preserve">gemini-2.5-flash</w:t>
       </w:r>
       <w:r>
         <w:t xml:space="preserve"> </w:t>
       </w:r>
       <w:r>
-        <w:t xml:space="preserve">and</w:t>
+        <w:t xml:space="preserve">(extraction), and</w:t>
       </w:r>
       <w:r>
         <w:t xml:space="preserve"> </w:t>
@@ -3410,7 +3437,19 @@
         <w:t xml:space="preserve"> </w:t>
       </w:r>
       <w:r>
-        <w:t xml:space="preserve">by name.</w:t>
+        <w:t xml:space="preserve">by name, set in</w:t>
+      </w:r>
+      <w:r>
+        <w:t xml:space="preserve"> </w:t>
+      </w:r>
+      <w:r>
+        <w:rPr>
+          <w:rStyle w:val="VerbatimChar"/>
+        </w:rPr>
+        <w:t xml:space="preserve">config/settings.yaml</w:t>
+      </w:r>
+      <w:r>
+        <w:t xml:space="preserve">.</w:t>
       </w:r>
     </w:p>
     <w:p>
@@ -3820,7 +3859,7 @@
           <w:b/>
           <w:bCs/>
         </w:rPr>
-        <w:t xml:space="preserve">Why BigQuery ML instead of custom training on Vertex AI?</w:t>
+        <w:t xml:space="preserve">Why BigQuery ML instead of custom training on Agent Platform?</w:t>
       </w:r>
     </w:p>
     <w:p>
@@ -3856,7 +3895,7 @@
         <w:t xml:space="preserve"> </w:t>
       </w:r>
       <w:r>
-        <w:t xml:space="preserve">Keep BigQuery ML for the regression adjustments, the market index, and the first AVM. Move a model to Vertex AI (AutoML Tabular or custom training) only if it needs a model type or tuning that BigQuery ML doesn't support. Register models in Vertex AI Model Registry either way.</w:t>
+        <w:t xml:space="preserve">Keep BigQuery ML for the regression adjustments, the market index, and the first AVM. Move a model to Agent Platform (AutoML Tabular or custom training) only if it needs a model type or tuning that BigQuery ML doesn't support. Register models in Model Registry in Agent Platform either way.</w:t>
       </w:r>
     </w:p>
     <w:p>
@@ -3868,7 +3907,7 @@
           <w:b/>
           <w:bCs/>
         </w:rPr>
-        <w:t xml:space="preserve">Why Gemini 2.5 Flash instead of Gemini 2.5 Pro?</w:t>
+        <w:t xml:space="preserve">Why Gemini 3.8 Flash for the agent and Gemini 2.5 Flash for extraction?</w:t>
       </w:r>
     </w:p>
     <w:p>
@@ -3886,7 +3925,7 @@
         <w:t xml:space="preserve"> </w:t>
       </w:r>
       <w:r>
-        <w:t xml:space="preserve">The agent's job is tool selection and short, cited explanations. Flash did that correctly in every test run, at 5–10 seconds and about a third of a cent per answer.</w:t>
+        <w:t xml:space="preserve">Each task gets the model that fits it. The agent is user-facing, so it uses the newest Flash model at a low thinking level: correct in every test run, 9–19 seconds, about a cent per answer. Extraction runs on every page of every document, so it uses Gemini 2.5 Flash, the lowest-cost model that extracted the facts correctly.</w:t>
       </w:r>
     </w:p>
     <w:p>
@@ -3904,7 +3943,7 @@
         <w:t xml:space="preserve"> </w:t>
       </w:r>
       <w:r>
-        <w:t xml:space="preserve">Decide with the evaluation set. Test Pro for complex multi-document questions and Flash-Lite for extraction, and choose per task on accuracy, latency, and cost.</w:t>
+        <w:t xml:space="preserve">Decide per task with the evaluation set. Test a Pro model for complex multi-document questions, and re-test extraction on newer Flash and Flash-Lite models as they become available in your region.</w:t>
       </w:r>
     </w:p>
     <w:p>
@@ -4156,7 +4195,7 @@
         <w:t xml:space="preserve"> </w:t>
       </w:r>
       <w:r>
-        <w:t xml:space="preserve">Retrain the AVM and adjustment models monthly and the market index as new sales close, with scheduled queries or Vertex AI Pipelines. Closed sales are the only training labels. Reviewer overrides feed evaluation and gate tuning, never training, so a mistaken override can't teach the model.</w:t>
+        <w:t xml:space="preserve">Retrain the AVM and adjustment models monthly and the market index as new sales close, with scheduled queries or pipelines in Agent Platform. Closed sales are the only training labels. Reviewer overrides feed evaluation and gate tuning, never training, so a mistaken override can't teach the model.</w:t>
       </w:r>
     </w:p>
     <w:bookmarkEnd w:id="29"/>
@@ -4262,7 +4301,16 @@
         <w:t xml:space="preserve"> </w:t>
       </w:r>
       <w:r>
-        <w:t xml:space="preserve">Grant least-privilege roles: BigQuery Data Editor and BigQuery Job User on specific datasets, Document AI API User, Vertex AI User, and Storage Object Viewer on the landing bucket.</w:t>
+        <w:t xml:space="preserve">Grant least-privilege roles: BigQuery Data Editor and BigQuery Job User on specific datasets, Document AI API User, the Agent Platform user role (</w:t>
+      </w:r>
+      <w:r>
+        <w:rPr>
+          <w:rStyle w:val="VerbatimChar"/>
+        </w:rPr>
+        <w:t xml:space="preserve">roles/aiplatform.user</w:t>
+      </w:r>
+      <w:r>
+        <w:t xml:space="preserve">), and Storage Object Viewer on the landing bucket.</w:t>
       </w:r>
     </w:p>
     <w:p>
@@ -4373,7 +4421,7 @@
         <w:t xml:space="preserve"> </w:t>
       </w:r>
       <w:r>
-        <w:t xml:space="preserve">Add VPC Service Controls around BigQuery, Vertex AI, and Document AI; customer-managed encryption keys if required; a defined data residency region; retention and deletion policies; and Cloud Audit Logs exported to a locked bucket.</w:t>
+        <w:t xml:space="preserve">Add VPC Service Controls around BigQuery, Agent Platform, and Document AI; customer-managed encryption keys if required; a defined data residency region; retention and deletion policies; and Cloud Audit Logs exported to a locked bucket.</w:t>
       </w:r>
     </w:p>
     <w:p>
@@ -5055,16 +5103,31 @@
               <w:pStyle w:val="Compact"/>
             </w:pPr>
             <w:r>
-              <w:t xml:space="preserve">Vertex AI</w:t>
-            </w:r>
-          </w:p>
-        </w:tc>
-        <w:tc>
-          <w:tcPr/>
-          <w:p>
-            <w:pPr>
-              <w:pStyle w:val="Compact"/>
-            </w:pPr>
+              <w:t xml:space="preserve">Agent Platform</w:t>
+            </w:r>
+          </w:p>
+        </w:tc>
+        <w:tc>
+          <w:tcPr/>
+          <w:p>
+            <w:pPr>
+              <w:pStyle w:val="Compact"/>
+            </w:pPr>
+            <w:r>
+              <w:rPr>
+                <w:rStyle w:val="VerbatimChar"/>
+              </w:rPr>
+              <w:t xml:space="preserve">gemini-3.8-flash</w:t>
+            </w:r>
+            <w:r>
+              <w:t xml:space="preserve"> </w:t>
+            </w:r>
+            <w:r>
+              <w:t xml:space="preserve">for the agent (global endpoint);</w:t>
+            </w:r>
+            <w:r>
+              <w:t xml:space="preserve"> </w:t>
+            </w:r>
             <w:r>
               <w:rPr>
                 <w:rStyle w:val="VerbatimChar"/>
@@ -5075,7 +5138,7 @@
               <w:t xml:space="preserve"> </w:t>
             </w:r>
             <w:r>
-              <w:t xml:space="preserve">for extraction and the agent;</w:t>
+              <w:t xml:space="preserve">for extraction;</w:t>
             </w:r>
             <w:r>
               <w:t xml:space="preserve"> </w:t>
@@ -5174,7 +5237,7 @@
               <w:t xml:space="preserve"> </w:t>
             </w:r>
             <w:r>
-              <w:t xml:space="preserve">(governance tables). One Cloud resource connection to Vertex AI.</w:t>
+              <w:t xml:space="preserve">(governance tables). One Cloud resource connection to Agent Platform.</w:t>
             </w:r>
           </w:p>
         </w:tc>
@@ -5424,7 +5487,7 @@
         </w:numPr>
       </w:pPr>
       <w:r>
-        <w:t xml:space="preserve">Vertex AI generative AI pricing: https://cloud.google.com/vertex-ai/generative-ai/pricing</w:t>
+        <w:t xml:space="preserve">Agent Platform generative AI pricing: https://cloud.google.com/vertex-ai/generative-ai/pricing</w:t>
       </w:r>
     </w:p>
     <w:p>

</xml_diff>

<commit_message>
Pin Gemini 2.5 Flash for the agent; record the Gemini 3.8 Flash evaluation
3.8 Flash gave the same tool calls and citations but is served only from the
global endpoint, which returned 504 timeouts on 6 of 6 calls on Oct 5. The agent
now pins 2.5 Flash in us-central1 with a 20 s per-call limit and a second-region
fallback; switching to 3.8 is one config line.
</commit_message>
<xml_diff>
--- a/docs/customer/Valuation assistant prototype - scope, design decisions, and path to production.docx
+++ b/docs/customer/Valuation assistant prototype - scope, design decisions, and path to production.docx
@@ -246,7 +246,7 @@
         </w:numPr>
       </w:pPr>
       <w:r>
-        <w:t xml:space="preserve">Answers questions through a Gemini agent on Gemini Enterprise Agent Platform (formerly Agent Platform) that calls tools. The agent explains; a deterministic valuation engine backed by BigQuery ML computes.</w:t>
+        <w:t xml:space="preserve">Answers questions through a Gemini agent on Gemini Enterprise Agent Platform (formerly Vertex AI) that calls tools. The agent explains; a deterministic valuation engine backed by BigQuery ML computes.</w:t>
       </w:r>
     </w:p>
     <w:p>
@@ -1394,40 +1394,52 @@
               <w:pStyle w:val="Compact"/>
             </w:pPr>
             <w:r>
-              <w:t xml:space="preserve">Gemini 3.8 Flash, low thinking level</w:t>
-            </w:r>
-          </w:p>
-        </w:tc>
-        <w:tc>
-          <w:tcPr/>
-          <w:p>
-            <w:pPr>
-              <w:pStyle w:val="Compact"/>
-            </w:pPr>
-            <w:r>
-              <w:t xml:space="preserve">The newest Flash model, where users see the reasoning. Reliable function calling. The agent explains and cites; it doesn't compute, so a low thinking level is enough.</w:t>
-            </w:r>
-          </w:p>
-        </w:tc>
-        <w:tc>
-          <w:tcPr/>
-          <w:p>
-            <w:pPr>
-              <w:pStyle w:val="Compact"/>
-            </w:pPr>
-            <w:r>
-              <w:t xml:space="preserve">Gemini 2.5 Flash (about a third of the cost, faster in-region, an older generation); Gemini Pro models (stronger reasoning, higher cost and latency); open models in Model Garden in Agent Platform (more to operate)</w:t>
-            </w:r>
-          </w:p>
-        </w:tc>
-        <w:tc>
-          <w:tcPr/>
-          <w:p>
-            <w:pPr>
-              <w:pStyle w:val="Compact"/>
-            </w:pPr>
-            <w:r>
-              <w:t xml:space="preserve">All three tools called and the correct page cited in every test run, including every demo scenario. 9–19 seconds per answer and about $0.011 (4 calls, 6,065 input and about 275 output tokens). The default thinking level took 16–62 seconds, so the agent uses the low level.</w:t>
+              <w:t xml:space="preserve">Gemini 2.5 Flash, pinned</w:t>
+            </w:r>
+          </w:p>
+        </w:tc>
+        <w:tc>
+          <w:tcPr/>
+          <w:p>
+            <w:pPr>
+              <w:pStyle w:val="Compact"/>
+            </w:pPr>
+            <w:r>
+              <w:t xml:space="preserve">Reliable function calling, 5–10 seconds, and low cost in</w:t>
+            </w:r>
+            <w:r>
+              <w:t xml:space="preserve"> </w:t>
+            </w:r>
+            <w:r>
+              <w:rPr>
+                <w:rStyle w:val="VerbatimChar"/>
+              </w:rPr>
+              <w:t xml:space="preserve">us-central1</w:t>
+            </w:r>
+            <w:r>
+              <w:t xml:space="preserve">. The agent explains and cites; it doesn't compute, so it doesn't need the strongest reasoning model.</w:t>
+            </w:r>
+          </w:p>
+        </w:tc>
+        <w:tc>
+          <w:tcPr/>
+          <w:p>
+            <w:pPr>
+              <w:pStyle w:val="Compact"/>
+            </w:pPr>
+            <w:r>
+              <w:t xml:space="preserve">Gemini 3.8 Flash (evaluated, see evidence); Gemini Pro models (stronger reasoning, higher cost and latency); open models in Model Garden (more to operate)</w:t>
+            </w:r>
+          </w:p>
+        </w:tc>
+        <w:tc>
+          <w:tcPr/>
+          <w:p>
+            <w:pPr>
+              <w:pStyle w:val="Compact"/>
+            </w:pPr>
+            <w:r>
+              <w:t xml:space="preserve">All three tools called and the correct page cited in every test run; 5–10 seconds and about $0.0033 per answer (4 calls, 5,862 input and 607 output tokens). Gemini 3.8 Flash was evaluated on October 5, 2026: the same tool calls and citations, 9–19 seconds at a low thinking level, about $0.011 per answer, but its only available endpoint (global) returned timeouts on 6 of 6 calls that afternoon. The demo pins Gemini 2.5 Flash and switches with one configuration line once 3.8 Flash is stable in the region.</w:t>
             </w:r>
           </w:p>
         </w:tc>
@@ -2048,19 +2060,7 @@
         <w:t xml:space="preserve"> </w:t>
       </w:r>
       <w:r>
-        <w:t xml:space="preserve">Calls now retry, fall back from Gemini 3.8 Flash on the global endpoint to Gemini 2.5 Flash in</w:t>
-      </w:r>
-      <w:r>
-        <w:t xml:space="preserve"> </w:t>
-      </w:r>
-      <w:r>
-        <w:rPr>
-          <w:rStyle w:val="VerbatimChar"/>
-        </w:rPr>
-        <w:t xml:space="preserve">us-central1</w:t>
-      </w:r>
-      <w:r>
-        <w:t xml:space="preserve">, and then show a clearly labeled saved answer.</w:t>
+        <w:t xml:space="preserve">Each model call now has a 20-second limit; a stalled or rate-limited call falls back to the same model in a second region, and then the app shows a clearly labeled saved answer.</w:t>
       </w:r>
     </w:p>
     <w:bookmarkEnd w:id="23"/>
@@ -2162,18 +2162,18 @@
               <w:pStyle w:val="Compact"/>
             </w:pPr>
             <w:r>
-              <w:t xml:space="preserve">Time to answer a question (4 model calls, Gemini 3.8 Flash)</w:t>
-            </w:r>
-          </w:p>
-        </w:tc>
-        <w:tc>
-          <w:tcPr/>
-          <w:p>
-            <w:pPr>
-              <w:pStyle w:val="Compact"/>
-            </w:pPr>
-            <w:r>
-              <w:t xml:space="preserve">9–19 seconds after warm-up; follow-up questions 2–6 seconds</w:t>
+              <w:t xml:space="preserve">Time to answer a question (4 model calls, Gemini 2.5 Flash)</w:t>
+            </w:r>
+          </w:p>
+        </w:tc>
+        <w:tc>
+          <w:tcPr/>
+          <w:p>
+            <w:pPr>
+              <w:pStyle w:val="Compact"/>
+            </w:pPr>
+            <w:r>
+              <w:t xml:space="preserve">5–10 seconds after warm-up; follow-up questions 2–6 seconds</w:t>
             </w:r>
           </w:p>
         </w:tc>
@@ -2489,29 +2489,29 @@
               <w:pStyle w:val="Compact"/>
             </w:pPr>
             <w:r>
-              <w:t xml:space="preserve">Gemini 3.8 Flash, per answer</w:t>
-            </w:r>
-          </w:p>
-        </w:tc>
-        <w:tc>
-          <w:tcPr/>
-          <w:p>
-            <w:pPr>
-              <w:pStyle w:val="Compact"/>
-            </w:pPr>
-            <w:r>
-              <w:t xml:space="preserve">4 calls, 6,065 input and about 275 output tokens (measured); $1.50 and $7.50 per 1M input and output tokens</w:t>
-            </w:r>
-          </w:p>
-        </w:tc>
-        <w:tc>
-          <w:tcPr/>
-          <w:p>
-            <w:pPr>
-              <w:pStyle w:val="Compact"/>
-            </w:pPr>
-            <w:r>
-              <w:t xml:space="preserve">$0.011 per answer</w:t>
+              <w:t xml:space="preserve">Gemini 2.5 Flash, per answer</w:t>
+            </w:r>
+          </w:p>
+        </w:tc>
+        <w:tc>
+          <w:tcPr/>
+          <w:p>
+            <w:pPr>
+              <w:pStyle w:val="Compact"/>
+            </w:pPr>
+            <w:r>
+              <w:t xml:space="preserve">4 calls, 5,862 input and 607 output tokens (measured); $0.30 and $2.50 per 1M input and output tokens</w:t>
+            </w:r>
+          </w:p>
+        </w:tc>
+        <w:tc>
+          <w:tcPr/>
+          <w:p>
+            <w:pPr>
+              <w:pStyle w:val="Compact"/>
+            </w:pPr>
+            <w:r>
+              <w:t xml:space="preserve">$0.0033 per answer</w:t>
             </w:r>
           </w:p>
         </w:tc>
@@ -2524,6 +2524,41 @@
               <w:pStyle w:val="Compact"/>
             </w:pPr>
             <w:r>
+              <w:t xml:space="preserve">Gemini 3.8 Flash, per answer (evaluated)</w:t>
+            </w:r>
+          </w:p>
+        </w:tc>
+        <w:tc>
+          <w:tcPr/>
+          <w:p>
+            <w:pPr>
+              <w:pStyle w:val="Compact"/>
+            </w:pPr>
+            <w:r>
+              <w:t xml:space="preserve">4 calls, 6,065 input and about 275 output tokens (measured); $1.50 and $7.50 per 1M tokens</w:t>
+            </w:r>
+          </w:p>
+        </w:tc>
+        <w:tc>
+          <w:tcPr/>
+          <w:p>
+            <w:pPr>
+              <w:pStyle w:val="Compact"/>
+            </w:pPr>
+            <w:r>
+              <w:t xml:space="preserve">$0.011 per answer</w:t>
+            </w:r>
+          </w:p>
+        </w:tc>
+      </w:tr>
+      <w:tr>
+        <w:tc>
+          <w:tcPr/>
+          <w:p>
+            <w:pPr>
+              <w:pStyle w:val="Compact"/>
+            </w:pPr>
+            <w:r>
               <w:t xml:space="preserve">BigQuery vector search</w:t>
             </w:r>
           </w:p>
@@ -2567,7 +2602,7 @@
         <w:t xml:space="preserve"> </w:t>
       </w:r>
       <w:r>
-        <w:t xml:space="preserve">For one county with 100,000 pages of backlog and 20,000 questions a month, the estimate is about $1,350 one time to parse the backlog, and about $270 a month to run (answers about $225, one always-on Cloud Run instance about $44, BigQuery $0 within free tiers). These volumes are assumptions; we'll size the pilot with your actual volumes.</w:t>
+        <w:t xml:space="preserve">For one county with 100,000 pages of backlog and 20,000 questions a month, the estimate is about $1,350 one time to parse the backlog, and about $110 a month to run (answers about $66, one always-on Cloud Run instance about $44, BigQuery $0 within free tiers). On Gemini 3.8 Flash, answers would cost about $225 a month. These volumes are assumptions; we'll size the pilot with your actual volumes.</w:t>
       </w:r>
     </w:p>
     <w:p>
@@ -3392,7 +3427,7 @@
         <w:t xml:space="preserve"> </w:t>
       </w:r>
       <w:r>
-        <w:t xml:space="preserve">The app calls</w:t>
+        <w:t xml:space="preserve">The app pins</w:t>
       </w:r>
       <w:r>
         <w:t xml:space="preserve"> </w:t>
@@ -3401,13 +3436,13 @@
         <w:rPr>
           <w:rStyle w:val="VerbatimChar"/>
         </w:rPr>
-        <w:t xml:space="preserve">gemini-3.8-flash</w:t>
-      </w:r>
-      <w:r>
-        <w:t xml:space="preserve"> </w:t>
-      </w:r>
-      <w:r>
-        <w:t xml:space="preserve">(agent),</w:t>
+        <w:t xml:space="preserve">gemini-2.5-flash</w:t>
+      </w:r>
+      <w:r>
+        <w:t xml:space="preserve"> </w:t>
+      </w:r>
+      <w:r>
+        <w:t xml:space="preserve">(agent and extraction) and</w:t>
       </w:r>
       <w:r>
         <w:t xml:space="preserve"> </w:t>
@@ -3416,13 +3451,13 @@
         <w:rPr>
           <w:rStyle w:val="VerbatimChar"/>
         </w:rPr>
-        <w:t xml:space="preserve">gemini-2.5-flash</w:t>
-      </w:r>
-      <w:r>
-        <w:t xml:space="preserve"> </w:t>
-      </w:r>
-      <w:r>
-        <w:t xml:space="preserve">(extraction), and</w:t>
+        <w:t xml:space="preserve">text-embedding-005</w:t>
+      </w:r>
+      <w:r>
+        <w:t xml:space="preserve"> </w:t>
+      </w:r>
+      <w:r>
+        <w:t xml:space="preserve">in</w:t>
       </w:r>
       <w:r>
         <w:t xml:space="preserve"> </w:t>
@@ -3431,25 +3466,10 @@
         <w:rPr>
           <w:rStyle w:val="VerbatimChar"/>
         </w:rPr>
-        <w:t xml:space="preserve">text-embedding-005</w:t>
-      </w:r>
-      <w:r>
-        <w:t xml:space="preserve"> </w:t>
-      </w:r>
-      <w:r>
-        <w:t xml:space="preserve">by name, set in</w:t>
-      </w:r>
-      <w:r>
-        <w:t xml:space="preserve"> </w:t>
-      </w:r>
-      <w:r>
-        <w:rPr>
-          <w:rStyle w:val="VerbatimChar"/>
-        </w:rPr>
         <w:t xml:space="preserve">config/settings.yaml</w:t>
       </w:r>
       <w:r>
-        <w:t xml:space="preserve">.</w:t>
+        <w:t xml:space="preserve">. Gemini 3.8 Flash was evaluated and can be switched on with one line.</w:t>
       </w:r>
     </w:p>
     <w:p>
@@ -3907,7 +3927,7 @@
           <w:b/>
           <w:bCs/>
         </w:rPr>
-        <w:t xml:space="preserve">Why Gemini 3.8 Flash for the agent and Gemini 2.5 Flash for extraction?</w:t>
+        <w:t xml:space="preserve">Why Gemini 2.5 Flash when Gemini 3.8 Flash is available?</w:t>
       </w:r>
     </w:p>
     <w:p>
@@ -3925,7 +3945,19 @@
         <w:t xml:space="preserve"> </w:t>
       </w:r>
       <w:r>
-        <w:t xml:space="preserve">Each task gets the model that fits it. The agent is user-facing, so it uses the newest Flash model at a low thinking level: correct in every test run, 9–19 seconds, about a cent per answer. Extraction runs on every page of every document, so it uses Gemini 2.5 Flash, the lowest-cost model that extracted the facts correctly.</w:t>
+        <w:t xml:space="preserve">We evaluated Gemini 3.8 Flash for the agent on October 5, 2026. It made the same tool calls and citations, took 9–19 seconds per answer at a low thinking level (16–62 seconds at the default level), and cost about $0.011 per answer, about 3 times Gemini 2.5 Flash. It's served only from the global endpoint for this project, and that afternoon 6 of 6 calls timed out. The demo pins Gemini 2.5 Flash in</w:t>
+      </w:r>
+      <w:r>
+        <w:t xml:space="preserve"> </w:t>
+      </w:r>
+      <w:r>
+        <w:rPr>
+          <w:rStyle w:val="VerbatimChar"/>
+        </w:rPr>
+        <w:t xml:space="preserve">us-central1</w:t>
+      </w:r>
+      <w:r>
+        <w:t xml:space="preserve">: 5–10 seconds, about $0.0033 per answer.</w:t>
       </w:r>
     </w:p>
     <w:p>
@@ -3943,7 +3975,7 @@
         <w:t xml:space="preserve"> </w:t>
       </w:r>
       <w:r>
-        <w:t xml:space="preserve">Decide per task with the evaluation set. Test a Pro model for complex multi-document questions, and re-test extraction on newer Flash and Flash-Lite models as they become available in your region.</w:t>
+        <w:t xml:space="preserve">Pin model versions, evaluate each new release against the evaluation set for accuracy, latency, reliability, and cost, and switch with a configuration change once it wins. Test a Pro model for complex multi-document questions.</w:t>
       </w:r>
     </w:p>
     <w:p>
@@ -5117,28 +5149,25 @@
               <w:rPr>
                 <w:rStyle w:val="VerbatimChar"/>
               </w:rPr>
-              <w:t xml:space="preserve">gemini-3.8-flash</w:t>
+              <w:t xml:space="preserve">gemini-2.5-flash</w:t>
             </w:r>
             <w:r>
               <w:t xml:space="preserve"> </w:t>
             </w:r>
             <w:r>
-              <w:t xml:space="preserve">for the agent (global endpoint);</w:t>
-            </w:r>
-            <w:r>
-              <w:t xml:space="preserve"> </w:t>
+              <w:t xml:space="preserve">for the agent and extraction (</w:t>
             </w:r>
             <w:r>
               <w:rPr>
                 <w:rStyle w:val="VerbatimChar"/>
               </w:rPr>
-              <w:t xml:space="preserve">gemini-2.5-flash</w:t>
+              <w:t xml:space="preserve">gemini-3.8-flash</w:t>
             </w:r>
             <w:r>
               <w:t xml:space="preserve"> </w:t>
             </w:r>
             <w:r>
-              <w:t xml:space="preserve">for extraction;</w:t>
+              <w:t xml:space="preserve">evaluated);</w:t>
             </w:r>
             <w:r>
               <w:t xml:space="preserve"> </w:t>

</xml_diff>

<commit_message>
Add cost per valuation, the follow-up routing lesson, and an end-to-end demo check
- README: cost table (per page, per answer, per valuation) and how to run
  scripts/check_demo.py
- Customer doc: cost per valuation and a new lesson from testing
</commit_message>
<xml_diff>
--- a/docs/customer/Valuation assistant prototype - scope, design decisions, and path to production.docx
+++ b/docs/customer/Valuation assistant prototype - scope, design decisions, and path to production.docx
@@ -2054,6 +2054,37 @@
           <w:b/>
           <w:bCs/>
         </w:rPr>
+        <w:t xml:space="preserve">Follow-up questions went to the wrong tool.</w:t>
+      </w:r>
+      <w:r>
+        <w:t xml:space="preserve"> </w:t>
+      </w:r>
+      <w:r>
+        <w:t xml:space="preserve">Asked why comparable sales were set aside, the agent searched the documents instead of the valuation and found nothing. Its instructions now route questions about value, comparable sales, and checks to the valuation tool, and questions about documents to the search tool. An end-to-end check script (</w:t>
+      </w:r>
+      <w:r>
+        <w:rPr>
+          <w:rStyle w:val="VerbatimChar"/>
+        </w:rPr>
+        <w:t xml:space="preserve">scripts/check_demo.py</w:t>
+      </w:r>
+      <w:r>
+        <w:t xml:space="preserve">) now covers follow-up questions.</w:t>
+      </w:r>
+    </w:p>
+    <w:p>
+      <w:pPr>
+        <w:pStyle w:val="Compact"/>
+        <w:numPr>
+          <w:ilvl w:val="0"/>
+          <w:numId w:val="1007"/>
+        </w:numPr>
+      </w:pPr>
+      <w:r>
+        <w:rPr>
+          <w:b/>
+          <w:bCs/>
+        </w:rPr>
         <w:t xml:space="preserve">Model quota limits occurred during testing.</w:t>
       </w:r>
       <w:r>
@@ -2245,7 +2276,7 @@
               <w:pStyle w:val="Compact"/>
             </w:pPr>
             <w:r>
-              <w:t xml:space="preserve">21 passing</w:t>
+              <w:t xml:space="preserve">21 passing unit and integration tests, plus a 45-check end-to-end script run against the deployed app</w:t>
             </w:r>
           </w:p>
         </w:tc>
@@ -2603,6 +2634,152 @@
       </w:r>
       <w:r>
         <w:t xml:space="preserve">For one county with 100,000 pages of backlog and 20,000 questions a month, the estimate is about $1,350 one time to parse the backlog, and about $110 a month to run (answers about $66, one always-on Cloud Run instance about $44, BigQuery $0 within free tiers). On Gemini 3.8 Flash, answers would cost about $225 a month. These volumes are assumptions; we'll size the pilot with your actual volumes.</w:t>
+      </w:r>
+    </w:p>
+    <w:p>
+      <w:pPr>
+        <w:pStyle w:val="BodyText"/>
+      </w:pPr>
+      <w:r>
+        <w:rPr>
+          <w:b/>
+          <w:bCs/>
+        </w:rPr>
+        <w:t xml:space="preserve">Cost per valuation.</w:t>
+      </w:r>
+      <w:r>
+        <w:t xml:space="preserve"> </w:t>
+      </w:r>
+      <w:r>
+        <w:t xml:space="preserve">Each page is parsed once, so the first valuation of a property carries its parsing cost and later valuations don't.</w:t>
+      </w:r>
+    </w:p>
+    <w:tbl>
+      <w:tblPr>
+        <w:tblStyle w:val="Table"/>
+        <w:tblW w:type="auto" w:w="0"/>
+        <w:tblLook w:firstRow="1" w:lastRow="0" w:firstColumn="0" w:lastColumn="0" w:noHBand="0" w:noVBand="0" w:val="0020"/>
+      </w:tblPr>
+      <w:tblGrid>
+        <w:gridCol w:w="2640"/>
+        <w:gridCol w:w="2640"/>
+        <w:gridCol w:w="2640"/>
+      </w:tblGrid>
+      <w:tr>
+        <w:trPr>
+          <w:tblHeader w:val="on"/>
+        </w:trPr>
+        <w:tc>
+          <w:tcPr/>
+          <w:p>
+            <w:pPr>
+              <w:pStyle w:val="Compact"/>
+            </w:pPr>
+            <w:r>
+              <w:t xml:space="preserve">Scenario</w:t>
+            </w:r>
+          </w:p>
+        </w:tc>
+        <w:tc>
+          <w:tcPr/>
+          <w:p>
+            <w:pPr>
+              <w:pStyle w:val="Compact"/>
+            </w:pPr>
+            <w:r>
+              <w:t xml:space="preserve">Includes</w:t>
+            </w:r>
+          </w:p>
+        </w:tc>
+        <w:tc>
+          <w:tcPr/>
+          <w:p>
+            <w:pPr>
+              <w:pStyle w:val="Compact"/>
+            </w:pPr>
+            <w:r>
+              <w:t xml:space="preserve">Cost</w:t>
+            </w:r>
+          </w:p>
+        </w:tc>
+      </w:tr>
+      <w:tr>
+        <w:tc>
+          <w:tcPr/>
+          <w:p>
+            <w:pPr>
+              <w:pStyle w:val="Compact"/>
+            </w:pPr>
+            <w:r>
+              <w:t xml:space="preserve">First valuation of a typical loan file</w:t>
+            </w:r>
+          </w:p>
+        </w:tc>
+        <w:tc>
+          <w:tcPr/>
+          <w:p>
+            <w:pPr>
+              <w:pStyle w:val="Compact"/>
+            </w:pPr>
+            <w:r>
+              <w:t xml:space="preserve">About 60 pages parsed (an assumption: appraisal about 30, inspection about 25, permits about 5) plus one answer</w:t>
+            </w:r>
+          </w:p>
+        </w:tc>
+        <w:tc>
+          <w:tcPr/>
+          <w:p>
+            <w:pPr>
+              <w:pStyle w:val="Compact"/>
+            </w:pPr>
+            <w:r>
+              <w:t xml:space="preserve">About $0.85</w:t>
+            </w:r>
+          </w:p>
+        </w:tc>
+      </w:tr>
+      <w:tr>
+        <w:tc>
+          <w:tcPr/>
+          <w:p>
+            <w:pPr>
+              <w:pStyle w:val="Compact"/>
+            </w:pPr>
+            <w:r>
+              <w:t xml:space="preserve">Re-valuation of a property already on file</w:t>
+            </w:r>
+          </w:p>
+        </w:tc>
+        <w:tc>
+          <w:tcPr/>
+          <w:p>
+            <w:pPr>
+              <w:pStyle w:val="Compact"/>
+            </w:pPr>
+            <w:r>
+              <w:t xml:space="preserve">One answer, a share of the Cloud Run instance, and a BigQuery vector search</w:t>
+            </w:r>
+          </w:p>
+        </w:tc>
+        <w:tc>
+          <w:tcPr/>
+          <w:p>
+            <w:pPr>
+              <w:pStyle w:val="Compact"/>
+            </w:pPr>
+            <w:r>
+              <w:t xml:space="preserve">About $0.005</w:t>
+            </w:r>
+          </w:p>
+        </w:tc>
+      </w:tr>
+    </w:tbl>
+    <w:p>
+      <w:pPr>
+        <w:pStyle w:val="BodyText"/>
+      </w:pPr>
+      <w:r>
+        <w:t xml:space="preserve">Cost scales with documents, not with questions.</w:t>
       </w:r>
     </w:p>
     <w:p>

</xml_diff>

<commit_message>
Customer doc and FAQ as Markdown so it renders on GitHub
</commit_message>
<xml_diff>
--- a/docs/customer/Valuation assistant prototype - scope, design decisions, and path to production.docx
+++ b/docs/customer/Valuation assistant prototype - scope, design decisions, and path to production.docx
@@ -136,7 +136,7 @@
               <w:pStyle w:val="Compact"/>
             </w:pPr>
             <w:r>
-              <w:t xml:space="preserve">October 4, 2026</w:t>
+              <w:t xml:space="preserve">October 5, 2026</w:t>
             </w:r>
           </w:p>
         </w:tc>
@@ -164,7 +164,7 @@
               <w:pStyle w:val="Compact"/>
             </w:pPr>
             <w:r>
-              <w:t xml:space="preserve">Technical evaluation deck; live prototype on Cloud Run (link shared separately)</w:t>
+              <w:t xml:space="preserve">Technical evaluation deck; source code at github.com/jackbrad/valuation-assistant-gcp; live prototype on Cloud Run (link shared separately)</w:t>
             </w:r>
           </w:p>
         </w:tc>

</xml_diff>